<commit_message>
como te extraño fer
</commit_message>
<xml_diff>
--- a/public/IPH_BARANDILLAS_PERSONA.docx
+++ b/public/IPH_BARANDILLAS_PERSONA.docx
@@ -508,9 +508,22 @@
                 <w:sz w:val="14"/>
                 <w:szCs w:val="14"/>
               </w:rPr>
-              <w:t>$m</w:t>
-            </w:r>
-            <w:r>
+              <w:t>$me</w:t>
+            </w:r>
+          </w:p>
+        </w:tc>
+        <w:tc>
+          <w:tcPr>
+            <w:tcW w:w="0" w:type="auto"/>
+            <w:tcBorders>
+              <w:top w:val="nil"/>
+              <w:bottom w:val="single" w:sz="4" w:space="0" w:color="auto"/>
+            </w:tcBorders>
+            <w:shd w:val="clear" w:color="auto" w:fill="C4BD97"/>
+          </w:tcPr>
+          <w:p>
+            <w:pPr>
+              <w:jc w:val="center"/>
               <w:rPr>
                 <w:rFonts w:ascii="Arial" w:hAnsi="Arial" w:cs="Arial"/>
                 <w:b/>
@@ -518,7 +531,16 @@
                 <w:sz w:val="14"/>
                 <w:szCs w:val="14"/>
               </w:rPr>
-              <w:t>e</w:t>
+            </w:pPr>
+            <w:r>
+              <w:rPr>
+                <w:rFonts w:ascii="Arial" w:hAnsi="Arial" w:cs="Arial"/>
+                <w:b/>
+                <w:bCs/>
+                <w:sz w:val="14"/>
+                <w:szCs w:val="14"/>
+              </w:rPr>
+              <w:t>$ye</w:t>
             </w:r>
           </w:p>
         </w:tc>
@@ -625,7 +647,6 @@
               <w:top w:val="nil"/>
               <w:bottom w:val="single" w:sz="4" w:space="0" w:color="auto"/>
             </w:tcBorders>
-            <w:shd w:val="clear" w:color="auto" w:fill="C4BD97"/>
           </w:tcPr>
           <w:p>
             <w:pPr>
@@ -646,8 +667,20 @@
                 <w:sz w:val="14"/>
                 <w:szCs w:val="14"/>
               </w:rPr>
-              <w:t>$ye</w:t>
-            </w:r>
+              <w:t>$</w:t>
+            </w:r>
+            <w:proofErr w:type="spellStart"/>
+            <w:r>
+              <w:rPr>
+                <w:rFonts w:ascii="Arial" w:hAnsi="Arial" w:cs="Arial"/>
+                <w:b/>
+                <w:bCs/>
+                <w:sz w:val="14"/>
+                <w:szCs w:val="14"/>
+              </w:rPr>
+              <w:t>ho</w:t>
+            </w:r>
+            <w:proofErr w:type="spellEnd"/>
           </w:p>
         </w:tc>
         <w:tc>
@@ -677,21 +710,10 @@
                 <w:sz w:val="14"/>
                 <w:szCs w:val="14"/>
               </w:rPr>
-              <w:t>$ho</w:t>
-            </w:r>
-          </w:p>
-        </w:tc>
-        <w:tc>
-          <w:tcPr>
-            <w:tcW w:w="0" w:type="auto"/>
-            <w:tcBorders>
-              <w:top w:val="nil"/>
-              <w:bottom w:val="single" w:sz="4" w:space="0" w:color="auto"/>
-            </w:tcBorders>
-          </w:tcPr>
-          <w:p>
-            <w:pPr>
-              <w:jc w:val="center"/>
+              <w:t>$</w:t>
+            </w:r>
+            <w:proofErr w:type="spellStart"/>
+            <w:r>
               <w:rPr>
                 <w:rFonts w:ascii="Arial" w:hAnsi="Arial" w:cs="Arial"/>
                 <w:b/>
@@ -699,17 +721,9 @@
                 <w:sz w:val="14"/>
                 <w:szCs w:val="14"/>
               </w:rPr>
-            </w:pPr>
-            <w:r>
-              <w:rPr>
-                <w:rFonts w:ascii="Arial" w:hAnsi="Arial" w:cs="Arial"/>
-                <w:b/>
-                <w:bCs/>
-                <w:sz w:val="14"/>
-                <w:szCs w:val="14"/>
-              </w:rPr>
-              <w:t>$ho</w:t>
-            </w:r>
+              <w:t>ho</w:t>
+            </w:r>
+            <w:proofErr w:type="spellEnd"/>
           </w:p>
         </w:tc>
         <w:tc>
@@ -2575,7 +2589,7 @@
         <w:tblLook w:val="04A0" w:firstRow="1" w:lastRow="0" w:firstColumn="1" w:lastColumn="0" w:noHBand="0" w:noVBand="1"/>
       </w:tblPr>
       <w:tblGrid>
-        <w:gridCol w:w="617"/>
+        <w:gridCol w:w="587"/>
         <w:gridCol w:w="380"/>
         <w:gridCol w:w="301"/>
         <w:gridCol w:w="79"/>
@@ -2590,14 +2604,14 @@
         <w:gridCol w:w="49"/>
         <w:gridCol w:w="465"/>
         <w:gridCol w:w="465"/>
-        <w:gridCol w:w="224"/>
+        <w:gridCol w:w="222"/>
         <w:gridCol w:w="543"/>
         <w:gridCol w:w="543"/>
-        <w:gridCol w:w="510"/>
-        <w:gridCol w:w="781"/>
-        <w:gridCol w:w="26"/>
-        <w:gridCol w:w="632"/>
-        <w:gridCol w:w="1907"/>
+        <w:gridCol w:w="412"/>
+        <w:gridCol w:w="1452"/>
+        <w:gridCol w:w="41"/>
+        <w:gridCol w:w="1291"/>
+        <w:gridCol w:w="4189"/>
       </w:tblGrid>
       <w:tr>
         <w:tc>
@@ -2938,27 +2952,9 @@
                 <w:sz w:val="14"/>
                 <w:szCs w:val="14"/>
               </w:rPr>
-              <w:t>$ho</w:t>
-            </w:r>
-          </w:p>
-        </w:tc>
-        <w:tc>
-          <w:tcPr>
-            <w:tcW w:w="282" w:type="dxa"/>
-            <w:tcBorders>
-              <w:bottom w:val="single" w:sz="4" w:space="0" w:color="auto"/>
-            </w:tcBorders>
-            <w:vAlign w:val="center"/>
-          </w:tcPr>
-          <w:p>
-            <w:pPr>
-              <w:ind w:right="-1227"/>
-              <w:rPr>
-                <w:rFonts w:ascii="Arial" w:hAnsi="Arial" w:cs="Arial"/>
-                <w:sz w:val="16"/>
-                <w:szCs w:val="16"/>
-              </w:rPr>
-            </w:pPr>
+              <w:t>$</w:t>
+            </w:r>
+            <w:proofErr w:type="spellStart"/>
             <w:r>
               <w:rPr>
                 <w:rFonts w:ascii="Arial" w:hAnsi="Arial" w:cs="Arial"/>
@@ -2967,8 +2963,50 @@
                 <w:sz w:val="14"/>
                 <w:szCs w:val="14"/>
               </w:rPr>
-              <w:t>$ho</w:t>
-            </w:r>
+              <w:t>ho</w:t>
+            </w:r>
+            <w:proofErr w:type="spellEnd"/>
+          </w:p>
+        </w:tc>
+        <w:tc>
+          <w:tcPr>
+            <w:tcW w:w="282" w:type="dxa"/>
+            <w:tcBorders>
+              <w:bottom w:val="single" w:sz="4" w:space="0" w:color="auto"/>
+            </w:tcBorders>
+            <w:vAlign w:val="center"/>
+          </w:tcPr>
+          <w:p>
+            <w:pPr>
+              <w:ind w:right="-1227"/>
+              <w:rPr>
+                <w:rFonts w:ascii="Arial" w:hAnsi="Arial" w:cs="Arial"/>
+                <w:sz w:val="16"/>
+                <w:szCs w:val="16"/>
+              </w:rPr>
+            </w:pPr>
+            <w:r>
+              <w:rPr>
+                <w:rFonts w:ascii="Arial" w:hAnsi="Arial" w:cs="Arial"/>
+                <w:b/>
+                <w:bCs/>
+                <w:sz w:val="14"/>
+                <w:szCs w:val="14"/>
+              </w:rPr>
+              <w:t>$</w:t>
+            </w:r>
+            <w:proofErr w:type="spellStart"/>
+            <w:r>
+              <w:rPr>
+                <w:rFonts w:ascii="Arial" w:hAnsi="Arial" w:cs="Arial"/>
+                <w:b/>
+                <w:bCs/>
+                <w:sz w:val="14"/>
+                <w:szCs w:val="14"/>
+              </w:rPr>
+              <w:t>ho</w:t>
+            </w:r>
+            <w:proofErr w:type="spellEnd"/>
           </w:p>
         </w:tc>
         <w:tc>
@@ -3101,19 +3139,19 @@
               <w:tblLook w:val="04A0" w:firstRow="1" w:lastRow="0" w:firstColumn="1" w:lastColumn="0" w:noHBand="0" w:noVBand="1"/>
             </w:tblPr>
             <w:tblGrid>
-              <w:gridCol w:w="222"/>
-              <w:gridCol w:w="222"/>
-              <w:gridCol w:w="222"/>
-              <w:gridCol w:w="222"/>
-              <w:gridCol w:w="222"/>
-              <w:gridCol w:w="222"/>
-              <w:gridCol w:w="222"/>
-              <w:gridCol w:w="222"/>
-              <w:gridCol w:w="222"/>
-              <w:gridCol w:w="222"/>
-              <w:gridCol w:w="222"/>
-              <w:gridCol w:w="222"/>
-              <w:gridCol w:w="222"/>
+              <w:gridCol w:w="519"/>
+              <w:gridCol w:w="519"/>
+              <w:gridCol w:w="519"/>
+              <w:gridCol w:w="519"/>
+              <w:gridCol w:w="519"/>
+              <w:gridCol w:w="519"/>
+              <w:gridCol w:w="519"/>
+              <w:gridCol w:w="519"/>
+              <w:gridCol w:w="519"/>
+              <w:gridCol w:w="519"/>
+              <w:gridCol w:w="519"/>
+              <w:gridCol w:w="519"/>
+              <w:gridCol w:w="519"/>
             </w:tblGrid>
             <w:tr>
               <w:tc>
@@ -3129,6 +3167,24 @@
                       <w:szCs w:val="16"/>
                     </w:rPr>
                   </w:pPr>
+                  <w:r>
+                    <w:rPr>
+                      <w:rFonts w:ascii="Arial" w:hAnsi="Arial" w:cs="Arial"/>
+                      <w:sz w:val="16"/>
+                      <w:szCs w:val="16"/>
+                    </w:rPr>
+                    <w:t>$</w:t>
+                  </w:r>
+                  <w:proofErr w:type="spellStart"/>
+                  <w:r>
+                    <w:rPr>
+                      <w:rFonts w:ascii="Arial" w:hAnsi="Arial" w:cs="Arial"/>
+                      <w:sz w:val="16"/>
+                      <w:szCs w:val="16"/>
+                    </w:rPr>
+                    <w:t>foc</w:t>
+                  </w:r>
+                  <w:proofErr w:type="spellEnd"/>
                 </w:p>
               </w:tc>
               <w:tc>
@@ -3144,6 +3200,24 @@
                       <w:szCs w:val="16"/>
                     </w:rPr>
                   </w:pPr>
+                  <w:r>
+                    <w:rPr>
+                      <w:rFonts w:ascii="Arial" w:hAnsi="Arial" w:cs="Arial"/>
+                      <w:sz w:val="16"/>
+                      <w:szCs w:val="16"/>
+                    </w:rPr>
+                    <w:t>$</w:t>
+                  </w:r>
+                  <w:proofErr w:type="spellStart"/>
+                  <w:r>
+                    <w:rPr>
+                      <w:rFonts w:ascii="Arial" w:hAnsi="Arial" w:cs="Arial"/>
+                      <w:sz w:val="16"/>
+                      <w:szCs w:val="16"/>
+                    </w:rPr>
+                    <w:t>foc</w:t>
+                  </w:r>
+                  <w:proofErr w:type="spellEnd"/>
                 </w:p>
               </w:tc>
               <w:tc>
@@ -3159,6 +3233,24 @@
                       <w:szCs w:val="16"/>
                     </w:rPr>
                   </w:pPr>
+                  <w:r>
+                    <w:rPr>
+                      <w:rFonts w:ascii="Arial" w:hAnsi="Arial" w:cs="Arial"/>
+                      <w:sz w:val="16"/>
+                      <w:szCs w:val="16"/>
+                    </w:rPr>
+                    <w:t>$</w:t>
+                  </w:r>
+                  <w:proofErr w:type="spellStart"/>
+                  <w:r>
+                    <w:rPr>
+                      <w:rFonts w:ascii="Arial" w:hAnsi="Arial" w:cs="Arial"/>
+                      <w:sz w:val="16"/>
+                      <w:szCs w:val="16"/>
+                    </w:rPr>
+                    <w:t>foc</w:t>
+                  </w:r>
+                  <w:proofErr w:type="spellEnd"/>
                 </w:p>
               </w:tc>
               <w:tc>
@@ -3174,6 +3266,24 @@
                       <w:szCs w:val="16"/>
                     </w:rPr>
                   </w:pPr>
+                  <w:r>
+                    <w:rPr>
+                      <w:rFonts w:ascii="Arial" w:hAnsi="Arial" w:cs="Arial"/>
+                      <w:sz w:val="16"/>
+                      <w:szCs w:val="16"/>
+                    </w:rPr>
+                    <w:t>$</w:t>
+                  </w:r>
+                  <w:proofErr w:type="spellStart"/>
+                  <w:r>
+                    <w:rPr>
+                      <w:rFonts w:ascii="Arial" w:hAnsi="Arial" w:cs="Arial"/>
+                      <w:sz w:val="16"/>
+                      <w:szCs w:val="16"/>
+                    </w:rPr>
+                    <w:t>foc</w:t>
+                  </w:r>
+                  <w:proofErr w:type="spellEnd"/>
                 </w:p>
               </w:tc>
               <w:tc>
@@ -3189,6 +3299,24 @@
                       <w:szCs w:val="16"/>
                     </w:rPr>
                   </w:pPr>
+                  <w:r>
+                    <w:rPr>
+                      <w:rFonts w:ascii="Arial" w:hAnsi="Arial" w:cs="Arial"/>
+                      <w:sz w:val="16"/>
+                      <w:szCs w:val="16"/>
+                    </w:rPr>
+                    <w:t>$</w:t>
+                  </w:r>
+                  <w:proofErr w:type="spellStart"/>
+                  <w:r>
+                    <w:rPr>
+                      <w:rFonts w:ascii="Arial" w:hAnsi="Arial" w:cs="Arial"/>
+                      <w:sz w:val="16"/>
+                      <w:szCs w:val="16"/>
+                    </w:rPr>
+                    <w:t>foc</w:t>
+                  </w:r>
+                  <w:proofErr w:type="spellEnd"/>
                 </w:p>
               </w:tc>
               <w:tc>
@@ -3204,6 +3332,24 @@
                       <w:szCs w:val="16"/>
                     </w:rPr>
                   </w:pPr>
+                  <w:r>
+                    <w:rPr>
+                      <w:rFonts w:ascii="Arial" w:hAnsi="Arial" w:cs="Arial"/>
+                      <w:sz w:val="16"/>
+                      <w:szCs w:val="16"/>
+                    </w:rPr>
+                    <w:t>$</w:t>
+                  </w:r>
+                  <w:proofErr w:type="spellStart"/>
+                  <w:r>
+                    <w:rPr>
+                      <w:rFonts w:ascii="Arial" w:hAnsi="Arial" w:cs="Arial"/>
+                      <w:sz w:val="16"/>
+                      <w:szCs w:val="16"/>
+                    </w:rPr>
+                    <w:t>foc</w:t>
+                  </w:r>
+                  <w:proofErr w:type="spellEnd"/>
                 </w:p>
               </w:tc>
               <w:tc>
@@ -3219,6 +3365,24 @@
                       <w:szCs w:val="16"/>
                     </w:rPr>
                   </w:pPr>
+                  <w:r>
+                    <w:rPr>
+                      <w:rFonts w:ascii="Arial" w:hAnsi="Arial" w:cs="Arial"/>
+                      <w:sz w:val="16"/>
+                      <w:szCs w:val="16"/>
+                    </w:rPr>
+                    <w:t>$</w:t>
+                  </w:r>
+                  <w:proofErr w:type="spellStart"/>
+                  <w:r>
+                    <w:rPr>
+                      <w:rFonts w:ascii="Arial" w:hAnsi="Arial" w:cs="Arial"/>
+                      <w:sz w:val="16"/>
+                      <w:szCs w:val="16"/>
+                    </w:rPr>
+                    <w:t>foc</w:t>
+                  </w:r>
+                  <w:proofErr w:type="spellEnd"/>
                 </w:p>
               </w:tc>
               <w:tc>
@@ -3234,6 +3398,24 @@
                       <w:szCs w:val="16"/>
                     </w:rPr>
                   </w:pPr>
+                  <w:r>
+                    <w:rPr>
+                      <w:rFonts w:ascii="Arial" w:hAnsi="Arial" w:cs="Arial"/>
+                      <w:sz w:val="16"/>
+                      <w:szCs w:val="16"/>
+                    </w:rPr>
+                    <w:t>$</w:t>
+                  </w:r>
+                  <w:proofErr w:type="spellStart"/>
+                  <w:r>
+                    <w:rPr>
+                      <w:rFonts w:ascii="Arial" w:hAnsi="Arial" w:cs="Arial"/>
+                      <w:sz w:val="16"/>
+                      <w:szCs w:val="16"/>
+                    </w:rPr>
+                    <w:t>foc</w:t>
+                  </w:r>
+                  <w:proofErr w:type="spellEnd"/>
                 </w:p>
               </w:tc>
               <w:tc>
@@ -3249,6 +3431,24 @@
                       <w:szCs w:val="16"/>
                     </w:rPr>
                   </w:pPr>
+                  <w:r>
+                    <w:rPr>
+                      <w:rFonts w:ascii="Arial" w:hAnsi="Arial" w:cs="Arial"/>
+                      <w:sz w:val="16"/>
+                      <w:szCs w:val="16"/>
+                    </w:rPr>
+                    <w:t>$</w:t>
+                  </w:r>
+                  <w:proofErr w:type="spellStart"/>
+                  <w:r>
+                    <w:rPr>
+                      <w:rFonts w:ascii="Arial" w:hAnsi="Arial" w:cs="Arial"/>
+                      <w:sz w:val="16"/>
+                      <w:szCs w:val="16"/>
+                    </w:rPr>
+                    <w:t>foc</w:t>
+                  </w:r>
+                  <w:proofErr w:type="spellEnd"/>
                 </w:p>
               </w:tc>
               <w:tc>
@@ -3264,6 +3464,24 @@
                       <w:szCs w:val="16"/>
                     </w:rPr>
                   </w:pPr>
+                  <w:r>
+                    <w:rPr>
+                      <w:rFonts w:ascii="Arial" w:hAnsi="Arial" w:cs="Arial"/>
+                      <w:sz w:val="16"/>
+                      <w:szCs w:val="16"/>
+                    </w:rPr>
+                    <w:t>$</w:t>
+                  </w:r>
+                  <w:proofErr w:type="spellStart"/>
+                  <w:r>
+                    <w:rPr>
+                      <w:rFonts w:ascii="Arial" w:hAnsi="Arial" w:cs="Arial"/>
+                      <w:sz w:val="16"/>
+                      <w:szCs w:val="16"/>
+                    </w:rPr>
+                    <w:t>foc</w:t>
+                  </w:r>
+                  <w:proofErr w:type="spellEnd"/>
                 </w:p>
               </w:tc>
               <w:tc>
@@ -3279,6 +3497,24 @@
                       <w:szCs w:val="16"/>
                     </w:rPr>
                   </w:pPr>
+                  <w:r>
+                    <w:rPr>
+                      <w:rFonts w:ascii="Arial" w:hAnsi="Arial" w:cs="Arial"/>
+                      <w:sz w:val="16"/>
+                      <w:szCs w:val="16"/>
+                    </w:rPr>
+                    <w:t>$</w:t>
+                  </w:r>
+                  <w:proofErr w:type="spellStart"/>
+                  <w:r>
+                    <w:rPr>
+                      <w:rFonts w:ascii="Arial" w:hAnsi="Arial" w:cs="Arial"/>
+                      <w:sz w:val="16"/>
+                      <w:szCs w:val="16"/>
+                    </w:rPr>
+                    <w:t>foc</w:t>
+                  </w:r>
+                  <w:proofErr w:type="spellEnd"/>
                 </w:p>
               </w:tc>
               <w:tc>
@@ -3294,6 +3530,24 @@
                       <w:szCs w:val="16"/>
                     </w:rPr>
                   </w:pPr>
+                  <w:r>
+                    <w:rPr>
+                      <w:rFonts w:ascii="Arial" w:hAnsi="Arial" w:cs="Arial"/>
+                      <w:sz w:val="16"/>
+                      <w:szCs w:val="16"/>
+                    </w:rPr>
+                    <w:t>$</w:t>
+                  </w:r>
+                  <w:proofErr w:type="spellStart"/>
+                  <w:r>
+                    <w:rPr>
+                      <w:rFonts w:ascii="Arial" w:hAnsi="Arial" w:cs="Arial"/>
+                      <w:sz w:val="16"/>
+                      <w:szCs w:val="16"/>
+                    </w:rPr>
+                    <w:t>foc</w:t>
+                  </w:r>
+                  <w:proofErr w:type="spellEnd"/>
                 </w:p>
               </w:tc>
               <w:tc>
@@ -3309,6 +3563,24 @@
                       <w:szCs w:val="16"/>
                     </w:rPr>
                   </w:pPr>
+                  <w:r>
+                    <w:rPr>
+                      <w:rFonts w:ascii="Arial" w:hAnsi="Arial" w:cs="Arial"/>
+                      <w:sz w:val="16"/>
+                      <w:szCs w:val="16"/>
+                    </w:rPr>
+                    <w:t>$</w:t>
+                  </w:r>
+                  <w:proofErr w:type="spellStart"/>
+                  <w:r>
+                    <w:rPr>
+                      <w:rFonts w:ascii="Arial" w:hAnsi="Arial" w:cs="Arial"/>
+                      <w:sz w:val="16"/>
+                      <w:szCs w:val="16"/>
+                    </w:rPr>
+                    <w:t>foc</w:t>
+                  </w:r>
+                  <w:proofErr w:type="spellEnd"/>
                 </w:p>
               </w:tc>
             </w:tr>
@@ -4378,6 +4650,7 @@
               </w:rPr>
               <w:t>$</w:t>
             </w:r>
+            <w:proofErr w:type="spellStart"/>
             <w:r>
               <w:rPr>
                 <w:rFonts w:ascii="Arial" w:hAnsi="Arial" w:cs="Arial"/>
@@ -4388,6 +4661,7 @@
               </w:rPr>
               <w:t>apellidoPaterno</w:t>
             </w:r>
+            <w:proofErr w:type="spellEnd"/>
           </w:p>
         </w:tc>
         <w:tc>
@@ -4421,18 +4695,20 @@
                 <w:sz w:val="16"/>
                 <w:szCs w:val="16"/>
               </w:rPr>
-              <w:t>$apellido</w:t>
-            </w:r>
-            <w:r>
-              <w:rPr>
-                <w:rFonts w:ascii="Arial" w:hAnsi="Arial" w:cs="Arial"/>
-                <w:b/>
-                <w:bCs/>
-                <w:sz w:val="16"/>
-                <w:szCs w:val="16"/>
-              </w:rPr>
-              <w:t>Materno</w:t>
-            </w:r>
+              <w:t>$</w:t>
+            </w:r>
+            <w:proofErr w:type="spellStart"/>
+            <w:r>
+              <w:rPr>
+                <w:rFonts w:ascii="Arial" w:hAnsi="Arial" w:cs="Arial"/>
+                <w:b/>
+                <w:bCs/>
+                <w:sz w:val="16"/>
+                <w:szCs w:val="16"/>
+              </w:rPr>
+              <w:t>apellidoMaterno</w:t>
+            </w:r>
+            <w:proofErr w:type="spellEnd"/>
           </w:p>
         </w:tc>
         <w:tc>
@@ -4465,17 +4741,7 @@
                 <w:sz w:val="16"/>
                 <w:szCs w:val="16"/>
               </w:rPr>
-              <w:t>$</w:t>
-            </w:r>
-            <w:r>
-              <w:rPr>
-                <w:rFonts w:ascii="Arial" w:hAnsi="Arial" w:cs="Arial"/>
-                <w:b/>
-                <w:bCs/>
-                <w:sz w:val="16"/>
-                <w:szCs w:val="16"/>
-              </w:rPr>
-              <w:t>nombre</w:t>
+              <w:t>$nombre</w:t>
             </w:r>
           </w:p>
         </w:tc>
@@ -5657,46 +5923,6 @@
                 <w:szCs w:val="16"/>
               </w:rPr>
             </w:pPr>
-            <w:r>
-              <w:rPr>
-                <w:rFonts w:ascii="Arial" w:hAnsi="Arial" w:cs="Arial"/>
-                <w:b/>
-                <w:bCs/>
-                <w:sz w:val="16"/>
-                <w:szCs w:val="16"/>
-              </w:rPr>
-              <w:t xml:space="preserve">$nombre </w:t>
-            </w:r>
-            <w:r>
-              <w:rPr>
-                <w:rFonts w:ascii="Arial" w:hAnsi="Arial" w:cs="Arial"/>
-                <w:b/>
-                <w:bCs/>
-                <w:sz w:val="16"/>
-                <w:szCs w:val="16"/>
-              </w:rPr>
-              <w:t>$apellidoPaterno</w:t>
-            </w:r>
-            <w:r>
-              <w:rPr>
-                <w:rFonts w:ascii="Arial" w:hAnsi="Arial" w:cs="Arial"/>
-                <w:b/>
-                <w:bCs/>
-                <w:sz w:val="16"/>
-                <w:szCs w:val="16"/>
-              </w:rPr>
-              <w:t xml:space="preserve"> </w:t>
-            </w:r>
-            <w:r>
-              <w:rPr>
-                <w:rFonts w:ascii="Arial" w:hAnsi="Arial" w:cs="Arial"/>
-                <w:b/>
-                <w:bCs/>
-                <w:sz w:val="16"/>
-                <w:szCs w:val="16"/>
-              </w:rPr>
-              <w:t>$apellidoMaterno</w:t>
-            </w:r>
           </w:p>
         </w:tc>
       </w:tr>
@@ -5754,16 +5980,6 @@
                 <w:szCs w:val="16"/>
               </w:rPr>
             </w:pPr>
-            <w:r>
-              <w:rPr>
-                <w:rFonts w:ascii="Arial" w:hAnsi="Arial" w:cs="Arial"/>
-                <w:b/>
-                <w:bCs/>
-                <w:sz w:val="16"/>
-                <w:szCs w:val="16"/>
-              </w:rPr>
-              <w:t>$unidad</w:t>
-            </w:r>
           </w:p>
         </w:tc>
       </w:tr>
@@ -5821,16 +6037,6 @@
                 <w:szCs w:val="16"/>
               </w:rPr>
             </w:pPr>
-            <w:r>
-              <w:rPr>
-                <w:rFonts w:ascii="Arial" w:hAnsi="Arial" w:cs="Arial"/>
-                <w:b/>
-                <w:bCs/>
-                <w:sz w:val="16"/>
-                <w:szCs w:val="16"/>
-              </w:rPr>
-              <w:t>Policía Estatal</w:t>
-            </w:r>
           </w:p>
         </w:tc>
       </w:tr>
@@ -6488,6 +6694,7 @@
               </w:rPr>
               <w:t xml:space="preserve">Sólo en caso de contar con </w:t>
             </w:r>
+            <w:proofErr w:type="spellStart"/>
             <w:r>
               <w:rPr>
                 <w:rFonts w:ascii="Arial" w:hAnsi="Arial" w:cs="Arial"/>
@@ -6502,7 +6709,16 @@
                 <w:sz w:val="16"/>
                 <w:szCs w:val="16"/>
               </w:rPr>
-              <w:t>l.</w:t>
+              <w:t>l</w:t>
+            </w:r>
+            <w:proofErr w:type="spellEnd"/>
+            <w:r>
+              <w:rPr>
+                <w:rFonts w:ascii="Arial" w:hAnsi="Arial" w:cs="Arial"/>
+                <w:sz w:val="16"/>
+                <w:szCs w:val="16"/>
+              </w:rPr>
+              <w:t>.</w:t>
             </w:r>
           </w:p>
         </w:tc>
@@ -6739,8 +6955,18 @@
                 <w:sz w:val="16"/>
                 <w:szCs w:val="16"/>
               </w:rPr>
-              <w:t xml:space="preserve"> $cp</w:t>
-            </w:r>
+              <w:t xml:space="preserve"> $</w:t>
+            </w:r>
+            <w:proofErr w:type="spellStart"/>
+            <w:r>
+              <w:rPr>
+                <w:rFonts w:ascii="Arial" w:hAnsi="Arial" w:cs="Arial"/>
+                <w:sz w:val="16"/>
+                <w:szCs w:val="16"/>
+              </w:rPr>
+              <w:t>cp</w:t>
+            </w:r>
+            <w:proofErr w:type="spellEnd"/>
           </w:p>
         </w:tc>
       </w:tr>
@@ -7021,8 +7247,18 @@
                 <w:sz w:val="16"/>
                 <w:szCs w:val="16"/>
               </w:rPr>
-              <w:t>$lat</w:t>
-            </w:r>
+              <w:t>$</w:t>
+            </w:r>
+            <w:proofErr w:type="spellStart"/>
+            <w:r>
+              <w:rPr>
+                <w:rFonts w:ascii="Arial" w:hAnsi="Arial" w:cs="Arial"/>
+                <w:sz w:val="16"/>
+                <w:szCs w:val="16"/>
+              </w:rPr>
+              <w:t>lat</w:t>
+            </w:r>
+            <w:proofErr w:type="spellEnd"/>
             <w:r>
               <w:rPr>
                 <w:rFonts w:ascii="Arial" w:hAnsi="Arial" w:cs="Arial"/>
@@ -7037,8 +7273,18 @@
                 <w:sz w:val="16"/>
                 <w:szCs w:val="16"/>
               </w:rPr>
-              <w:t xml:space="preserve"> $lng</w:t>
-            </w:r>
+              <w:t xml:space="preserve"> $</w:t>
+            </w:r>
+            <w:proofErr w:type="spellStart"/>
+            <w:r>
+              <w:rPr>
+                <w:rFonts w:ascii="Arial" w:hAnsi="Arial" w:cs="Arial"/>
+                <w:sz w:val="16"/>
+                <w:szCs w:val="16"/>
+              </w:rPr>
+              <w:t>lng</w:t>
+            </w:r>
+            <w:proofErr w:type="spellEnd"/>
           </w:p>
         </w:tc>
       </w:tr>
@@ -8686,8 +8932,20 @@
                       <w:sz w:val="14"/>
                       <w:szCs w:val="14"/>
                     </w:rPr>
-                    <w:t>$ho</w:t>
+                    <w:t>$</w:t>
                   </w:r>
+                  <w:proofErr w:type="spellStart"/>
+                  <w:r>
+                    <w:rPr>
+                      <w:rFonts w:ascii="Arial" w:hAnsi="Arial" w:cs="Arial"/>
+                      <w:b/>
+                      <w:bCs/>
+                      <w:sz w:val="14"/>
+                      <w:szCs w:val="14"/>
+                    </w:rPr>
+                    <w:t>ho</w:t>
+                  </w:r>
+                  <w:proofErr w:type="spellEnd"/>
                 </w:p>
               </w:tc>
               <w:tc>
@@ -8716,8 +8974,20 @@
                       <w:sz w:val="14"/>
                       <w:szCs w:val="14"/>
                     </w:rPr>
-                    <w:t>$ho</w:t>
+                    <w:t>$</w:t>
                   </w:r>
+                  <w:proofErr w:type="spellStart"/>
+                  <w:r>
+                    <w:rPr>
+                      <w:rFonts w:ascii="Arial" w:hAnsi="Arial" w:cs="Arial"/>
+                      <w:b/>
+                      <w:bCs/>
+                      <w:sz w:val="14"/>
+                      <w:szCs w:val="14"/>
+                    </w:rPr>
+                    <w:t>ho</w:t>
+                  </w:r>
+                  <w:proofErr w:type="spellEnd"/>
                 </w:p>
               </w:tc>
               <w:tc>
@@ -9087,8 +9357,18 @@
                 <w:b/>
                 <w:bCs/>
               </w:rPr>
-              <w:t>$apellidoPaterno</w:t>
-            </w:r>
+              <w:t>$</w:t>
+            </w:r>
+            <w:proofErr w:type="spellStart"/>
+            <w:r>
+              <w:rPr>
+                <w:rFonts w:ascii="Arial" w:hAnsi="Arial" w:cs="Arial"/>
+                <w:b/>
+                <w:bCs/>
+              </w:rPr>
+              <w:t>apellidoPaterno</w:t>
+            </w:r>
+            <w:proofErr w:type="spellEnd"/>
           </w:p>
         </w:tc>
         <w:tc>
@@ -9118,8 +9398,18 @@
                 <w:b/>
                 <w:bCs/>
               </w:rPr>
-              <w:t>$apellidoMaterno</w:t>
-            </w:r>
+              <w:t>$</w:t>
+            </w:r>
+            <w:proofErr w:type="spellStart"/>
+            <w:r>
+              <w:rPr>
+                <w:rFonts w:ascii="Arial" w:hAnsi="Arial" w:cs="Arial"/>
+                <w:b/>
+                <w:bCs/>
+              </w:rPr>
+              <w:t>apellidoMaterno</w:t>
+            </w:r>
+            <w:proofErr w:type="spellEnd"/>
           </w:p>
         </w:tc>
         <w:tc>
@@ -9517,8 +9807,18 @@
                       <w:b/>
                       <w:bCs/>
                     </w:rPr>
-                    <w:t>$nac</w:t>
+                    <w:t>$</w:t>
                   </w:r>
+                  <w:proofErr w:type="spellStart"/>
+                  <w:r>
+                    <w:rPr>
+                      <w:rFonts w:ascii="Arial" w:hAnsi="Arial" w:cs="Arial"/>
+                      <w:b/>
+                      <w:bCs/>
+                    </w:rPr>
+                    <w:t>nac</w:t>
+                  </w:r>
+                  <w:proofErr w:type="spellEnd"/>
                 </w:p>
               </w:tc>
             </w:tr>
@@ -9596,8 +9896,18 @@
                       <w:b/>
                       <w:bCs/>
                     </w:rPr>
-                    <w:t>$ext</w:t>
+                    <w:t>$</w:t>
                   </w:r>
+                  <w:proofErr w:type="spellStart"/>
+                  <w:r>
+                    <w:rPr>
+                      <w:rFonts w:ascii="Arial" w:hAnsi="Arial" w:cs="Arial"/>
+                      <w:b/>
+                      <w:bCs/>
+                    </w:rPr>
+                    <w:t>ext</w:t>
+                  </w:r>
+                  <w:proofErr w:type="spellEnd"/>
                 </w:p>
               </w:tc>
             </w:tr>
@@ -9644,8 +9954,18 @@
                 <w:sz w:val="18"/>
                 <w:szCs w:val="18"/>
               </w:rPr>
-              <w:t xml:space="preserve"> $extcu</w:t>
-            </w:r>
+              <w:t xml:space="preserve"> $</w:t>
+            </w:r>
+            <w:proofErr w:type="spellStart"/>
+            <w:r>
+              <w:rPr>
+                <w:rFonts w:ascii="Arial" w:hAnsi="Arial" w:cs="Arial"/>
+                <w:sz w:val="18"/>
+                <w:szCs w:val="18"/>
+              </w:rPr>
+              <w:t>extcu</w:t>
+            </w:r>
+            <w:proofErr w:type="spellEnd"/>
           </w:p>
         </w:tc>
       </w:tr>
@@ -9745,8 +10065,18 @@
                       <w:b/>
                       <w:bCs/>
                     </w:rPr>
-                    <w:t>$sf</w:t>
+                    <w:t>$</w:t>
                   </w:r>
+                  <w:proofErr w:type="spellStart"/>
+                  <w:r>
+                    <w:rPr>
+                      <w:rFonts w:ascii="Arial" w:hAnsi="Arial" w:cs="Arial"/>
+                      <w:b/>
+                      <w:bCs/>
+                    </w:rPr>
+                    <w:t>sf</w:t>
+                  </w:r>
+                  <w:proofErr w:type="spellEnd"/>
                 </w:p>
               </w:tc>
             </w:tr>
@@ -9825,8 +10155,18 @@
                       <w:b/>
                       <w:bCs/>
                     </w:rPr>
-                    <w:t>$sm</w:t>
+                    <w:t>$</w:t>
                   </w:r>
+                  <w:proofErr w:type="spellStart"/>
+                  <w:r>
+                    <w:rPr>
+                      <w:rFonts w:ascii="Arial" w:hAnsi="Arial" w:cs="Arial"/>
+                      <w:b/>
+                      <w:bCs/>
+                    </w:rPr>
+                    <w:t>sm</w:t>
+                  </w:r>
+                  <w:proofErr w:type="spellEnd"/>
                 </w:p>
               </w:tc>
             </w:tr>
@@ -10597,8 +10937,18 @@
                 <w:sz w:val="18"/>
                 <w:szCs w:val="18"/>
               </w:rPr>
-              <w:t xml:space="preserve"> $cp</w:t>
-            </w:r>
+              <w:t xml:space="preserve"> $</w:t>
+            </w:r>
+            <w:proofErr w:type="spellStart"/>
+            <w:r>
+              <w:rPr>
+                <w:rFonts w:ascii="Arial" w:hAnsi="Arial" w:cs="Arial"/>
+                <w:sz w:val="18"/>
+                <w:szCs w:val="18"/>
+              </w:rPr>
+              <w:t>cp</w:t>
+            </w:r>
+            <w:proofErr w:type="spellEnd"/>
           </w:p>
         </w:tc>
       </w:tr>
@@ -10811,8 +11161,18 @@
                 <w:b/>
                 <w:bCs/>
               </w:rPr>
-              <w:t>$descripciónfisica</w:t>
-            </w:r>
+              <w:t>$</w:t>
+            </w:r>
+            <w:proofErr w:type="spellStart"/>
+            <w:r>
+              <w:rPr>
+                <w:rFonts w:ascii="Arial" w:hAnsi="Arial" w:cs="Arial"/>
+                <w:b/>
+                <w:bCs/>
+              </w:rPr>
+              <w:t>descripciónfisica</w:t>
+            </w:r>
+            <w:proofErr w:type="spellEnd"/>
           </w:p>
         </w:tc>
       </w:tr>
@@ -11001,8 +11361,18 @@
                 <w:b/>
                 <w:bCs/>
               </w:rPr>
-              <w:t>$apellidoPaterno</w:t>
-            </w:r>
+              <w:t>$</w:t>
+            </w:r>
+            <w:proofErr w:type="spellStart"/>
+            <w:r>
+              <w:rPr>
+                <w:rFonts w:ascii="Arial" w:hAnsi="Arial" w:cs="Arial"/>
+                <w:b/>
+                <w:bCs/>
+              </w:rPr>
+              <w:t>apellidoPaterno</w:t>
+            </w:r>
+            <w:proofErr w:type="spellEnd"/>
           </w:p>
         </w:tc>
         <w:tc>
@@ -11030,8 +11400,18 @@
                 <w:b/>
                 <w:bCs/>
               </w:rPr>
-              <w:t>$apellidoMaterno</w:t>
-            </w:r>
+              <w:t>$</w:t>
+            </w:r>
+            <w:proofErr w:type="spellStart"/>
+            <w:r>
+              <w:rPr>
+                <w:rFonts w:ascii="Arial" w:hAnsi="Arial" w:cs="Arial"/>
+                <w:b/>
+                <w:bCs/>
+              </w:rPr>
+              <w:t>apellidoMaterno</w:t>
+            </w:r>
+            <w:proofErr w:type="spellEnd"/>
           </w:p>
         </w:tc>
         <w:tc>
@@ -11578,6 +11958,7 @@
                 <w:bCs/>
               </w:rPr>
             </w:pPr>
+            <w:proofErr w:type="spellStart"/>
             <w:r>
               <w:rPr>
                 <w:rFonts w:ascii="Arial" w:hAnsi="Arial" w:cs="Arial"/>
@@ -11585,7 +11966,17 @@
                 <w:bCs/>
                 <w:color w:val="FFFFFF" w:themeColor="background1"/>
               </w:rPr>
-              <w:t>partado B.1 Fecha y hora de la retención del vehículo</w:t>
+              <w:t>partado</w:t>
+            </w:r>
+            <w:proofErr w:type="spellEnd"/>
+            <w:r>
+              <w:rPr>
+                <w:rFonts w:ascii="Arial" w:hAnsi="Arial" w:cs="Arial"/>
+                <w:b/>
+                <w:bCs/>
+                <w:color w:val="FFFFFF" w:themeColor="background1"/>
+              </w:rPr>
+              <w:t xml:space="preserve"> B.1 Fecha y hora de la retención del vehículo</w:t>
             </w:r>
           </w:p>
         </w:tc>
@@ -12234,8 +12625,20 @@
                       <w:sz w:val="14"/>
                       <w:szCs w:val="14"/>
                     </w:rPr>
-                    <w:t>$ho</w:t>
+                    <w:t>$</w:t>
                   </w:r>
+                  <w:proofErr w:type="spellStart"/>
+                  <w:r>
+                    <w:rPr>
+                      <w:rFonts w:ascii="Arial" w:hAnsi="Arial" w:cs="Arial"/>
+                      <w:b/>
+                      <w:bCs/>
+                      <w:sz w:val="14"/>
+                      <w:szCs w:val="14"/>
+                    </w:rPr>
+                    <w:t>ho</w:t>
+                  </w:r>
+                  <w:proofErr w:type="spellEnd"/>
                 </w:p>
               </w:tc>
               <w:tc>
@@ -12264,8 +12667,20 @@
                       <w:sz w:val="14"/>
                       <w:szCs w:val="14"/>
                     </w:rPr>
-                    <w:t>$ho</w:t>
+                    <w:t>$</w:t>
                   </w:r>
+                  <w:proofErr w:type="spellStart"/>
+                  <w:r>
+                    <w:rPr>
+                      <w:rFonts w:ascii="Arial" w:hAnsi="Arial" w:cs="Arial"/>
+                      <w:b/>
+                      <w:bCs/>
+                      <w:sz w:val="14"/>
+                      <w:szCs w:val="14"/>
+                    </w:rPr>
+                    <w:t>ho</w:t>
+                  </w:r>
+                  <w:proofErr w:type="spellEnd"/>
                 </w:p>
               </w:tc>
               <w:tc>
@@ -13083,8 +13498,18 @@
                 <w:sz w:val="18"/>
                 <w:szCs w:val="18"/>
               </w:rPr>
-              <w:t xml:space="preserve"> $linea</w:t>
-            </w:r>
+              <w:t xml:space="preserve"> $</w:t>
+            </w:r>
+            <w:proofErr w:type="spellStart"/>
+            <w:r>
+              <w:rPr>
+                <w:rFonts w:ascii="Arial" w:hAnsi="Arial" w:cs="Arial"/>
+                <w:sz w:val="18"/>
+                <w:szCs w:val="18"/>
+              </w:rPr>
+              <w:t>linea</w:t>
+            </w:r>
+            <w:proofErr w:type="spellEnd"/>
           </w:p>
         </w:tc>
         <w:tc>
@@ -13361,8 +13786,18 @@
                       <w:b/>
                       <w:bCs/>
                     </w:rPr>
-                    <w:t>$upu</w:t>
+                    <w:t>$</w:t>
                   </w:r>
+                  <w:proofErr w:type="spellStart"/>
+                  <w:r>
+                    <w:rPr>
+                      <w:rFonts w:ascii="Arial" w:hAnsi="Arial" w:cs="Arial"/>
+                      <w:b/>
+                      <w:bCs/>
+                    </w:rPr>
+                    <w:t>upu</w:t>
+                  </w:r>
+                  <w:proofErr w:type="spellEnd"/>
                 </w:p>
               </w:tc>
             </w:tr>
@@ -13668,47 +14103,43 @@
                 <w:sz w:val="18"/>
                 <w:szCs w:val="18"/>
               </w:rPr>
-              <w:t xml:space="preserve">Para el traslado del vehículo, fui auxiliado por la grúa particular $grua, </w:t>
-            </w:r>
+              <w:t>Para el traslado del vehículo, fui auxiliado por la grúa particular $</w:t>
+            </w:r>
+            <w:proofErr w:type="spellStart"/>
             <w:r>
               <w:rPr>
                 <w:rFonts w:ascii="Arial" w:hAnsi="Arial" w:cs="Arial"/>
                 <w:sz w:val="18"/>
                 <w:szCs w:val="18"/>
               </w:rPr>
-              <w:t>resguardándolo</w:t>
-            </w:r>
+              <w:t>grua</w:t>
+            </w:r>
+            <w:proofErr w:type="spellEnd"/>
             <w:r>
               <w:rPr>
                 <w:rFonts w:ascii="Arial" w:hAnsi="Arial" w:cs="Arial"/>
                 <w:sz w:val="18"/>
                 <w:szCs w:val="18"/>
               </w:rPr>
-              <w:t xml:space="preserve"> en sus propias </w:t>
-            </w:r>
+              <w:t>, resguardándolo en sus propias instalaciones, ubicadas en $</w:t>
+            </w:r>
+            <w:proofErr w:type="spellStart"/>
             <w:r>
               <w:rPr>
                 <w:rFonts w:ascii="Arial" w:hAnsi="Arial" w:cs="Arial"/>
                 <w:sz w:val="18"/>
                 <w:szCs w:val="18"/>
               </w:rPr>
-              <w:t>instalaciones</w:t>
-            </w:r>
+              <w:t>grua</w:t>
+            </w:r>
+            <w:proofErr w:type="spellEnd"/>
             <w:r>
               <w:rPr>
                 <w:rFonts w:ascii="Arial" w:hAnsi="Arial" w:cs="Arial"/>
                 <w:sz w:val="18"/>
                 <w:szCs w:val="18"/>
               </w:rPr>
-              <w:t xml:space="preserve">, ubicadas en $grua, garaje de apoyo a esta </w:t>
-            </w:r>
-            <w:r>
-              <w:rPr>
-                <w:rFonts w:ascii="Arial" w:hAnsi="Arial" w:cs="Arial"/>
-                <w:sz w:val="18"/>
-                <w:szCs w:val="18"/>
-              </w:rPr>
-              <w:t>dependencia</w:t>
+              <w:t>, garaje de apoyo a esta dependencia</w:t>
             </w:r>
           </w:p>
           <w:p>
@@ -13821,8 +14252,18 @@
                 <w:b/>
                 <w:bCs/>
               </w:rPr>
-              <w:t>$apellidoPaterno</w:t>
-            </w:r>
+              <w:t>$</w:t>
+            </w:r>
+            <w:proofErr w:type="spellStart"/>
+            <w:r>
+              <w:rPr>
+                <w:rFonts w:ascii="Arial" w:hAnsi="Arial" w:cs="Arial"/>
+                <w:b/>
+                <w:bCs/>
+              </w:rPr>
+              <w:t>apellidoPaterno</w:t>
+            </w:r>
+            <w:proofErr w:type="spellEnd"/>
           </w:p>
         </w:tc>
         <w:tc>
@@ -13850,8 +14291,18 @@
                 <w:b/>
                 <w:bCs/>
               </w:rPr>
-              <w:t>$apellidoMaterno</w:t>
-            </w:r>
+              <w:t>$</w:t>
+            </w:r>
+            <w:proofErr w:type="spellStart"/>
+            <w:r>
+              <w:rPr>
+                <w:rFonts w:ascii="Arial" w:hAnsi="Arial" w:cs="Arial"/>
+                <w:b/>
+                <w:bCs/>
+              </w:rPr>
+              <w:t>apellidoMaterno</w:t>
+            </w:r>
+            <w:proofErr w:type="spellEnd"/>
           </w:p>
         </w:tc>
         <w:tc>
@@ -14816,6 +15267,7 @@
   <w:style w:type="character" w:default="1" w:styleId="Fuentedeprrafopredeter">
     <w:name w:val="Default Paragraph Font"/>
     <w:uiPriority w:val="1"/>
+    <w:semiHidden/>
     <w:unhideWhenUsed/>
   </w:style>
   <w:style w:type="table" w:default="1" w:styleId="Tablanormal">

</xml_diff>